<commit_message>
Hợp đồng: cập nhật template Word + bản PDF theo nội dung Phụ lục đã sửa
Người dùng chỉnh lại trực tiếp trong Word (bảng phí dịch vụ hành chính
nhân sự + phần Lưu ý) — build lại template từ file mới và đồng bộ cùng
nội dung vào bản PDF (route.js) để 2 định dạng khớp nhau:
- Bảng phí HC-NS: rút từ 6 mức xuống 4 mức, đổi giá (3tr/7.5tr/10tr,
  6tr/10tr/12.5tr, 9tr/12.5tr/14tr, "Trên 30 LĐ BHXH" thỏa thuận).
- "dưới 10 người" -> "dưới 5 người".
- Lưu ý: bỏ phụ thu theo quận/huyện cụ thể + câu "phụ thuộc đặc thù
  doanh nghiệp", thay bằng "Phụ thu xăng xe... trên 7km"; rút ngắn câu
  "thuế giá trị gia tăng" -> "thuế VAT".

Co-Authored-By: Claude Sonnet 4.6 <noreply@anthropic.com>
</commit_message>
<xml_diff>
--- a/templates/hop-dong-dich-vu.docx
+++ b/templates/hop-dong-dich-vu.docx
@@ -116,8 +116,6 @@
         </w:rPr>
         <w:t>Căn cứ Luật Quản lý thuế số 106/2016/QH13 có hiệu lực thi hành từ ngày 01/07/2016.</w:t>
       </w:r>
-      <w:bookmarkStart w:id="0" w:name="_GoBack"/>
-      <w:bookmarkEnd w:id="0"/>
     </w:p>
     <w:p>
       <w:pPr>
@@ -896,6 +894,7 @@
           <w:sz w:val="26"/>
           <w:szCs w:val="26"/>
         </w:rPr>
+        <w:lastRenderedPageBreak/>
         <w:t>Trình bày, tư vấn về thuế trong quá trình thực hiện dịch vụ.</w:t>
       </w:r>
     </w:p>
@@ -922,7 +921,6 @@
           <w:sz w:val="26"/>
           <w:szCs w:val="26"/>
         </w:rPr>
-        <w:lastRenderedPageBreak/>
         <w:t>Thực hiện các báo cáo đối với cơ quan thống kê.</w:t>
       </w:r>
     </w:p>
@@ -2066,17 +2064,8 @@
           <w:sz w:val="26"/>
           <w:szCs w:val="26"/>
         </w:rPr>
-        <w:t xml:space="preserve">Không được tiết lộ cho bất cứ Bên thứ 3 kể cả cơ quan có thẩm quyền bất kỳ thông tin nào của bên A, không giới hạn những thông tin bảo mật, nguyên vật liệu, tài liệu </w:t>
-      </w:r>
-      <w:r>
-        <w:rPr>
-          <w:rFonts w:ascii="Times New Roman" w:eastAsia="Times New Roman" w:hAnsi="Times New Roman" w:cs="Times New Roman"/>
-          <w:color w:val="1A1A1A"/>
-          <w:sz w:val="26"/>
-          <w:szCs w:val="26"/>
-        </w:rPr>
         <w:lastRenderedPageBreak/>
-        <w:t>liên quan đến hoạt động kinh doanh, tài chính hay bất kỳ chế độ phúc lợi nào của bên A hoặc các Công ty con hay Công ty liên quan đến bên A nếu không được sự đồng ý của bên A.</w:t>
+        <w:t>Không được tiết lộ cho bất cứ Bên thứ 3 kể cả cơ quan có thẩm quyền bất kỳ thông tin nào của bên A, không giới hạn những thông tin bảo mật, nguyên vật liệu, tài liệu liên quan đến hoạt động kinh doanh, tài chính hay bất kỳ chế độ phúc lợi nào của bên A hoặc các Công ty con hay Công ty liên quan đến bên A nếu không được sự đồng ý của bên A.</w:t>
       </w:r>
     </w:p>
     <w:p>
@@ -4019,10 +4008,10 @@
       </w:tblPr>
       <w:tblGrid>
         <w:gridCol w:w="413"/>
-        <w:gridCol w:w="3118"/>
-        <w:gridCol w:w="1504"/>
-        <w:gridCol w:w="1844"/>
-        <w:gridCol w:w="2476"/>
+        <w:gridCol w:w="3099"/>
+        <w:gridCol w:w="1500"/>
+        <w:gridCol w:w="1878"/>
+        <w:gridCol w:w="2465"/>
       </w:tblGrid>
       <w:tr>
         <w:trPr>
@@ -4362,7 +4351,34 @@
                 <w:sz w:val="21"/>
                 <w:szCs w:val="21"/>
               </w:rPr>
-              <w:t>1.500.000</w:t>
+              <w:t>3</w:t>
+            </w:r>
+            <w:r>
+              <w:rPr>
+                <w:rFonts w:ascii="Times New Roman" w:eastAsia="Times New Roman" w:hAnsi="Times New Roman" w:cs="Times New Roman"/>
+                <w:color w:val="1A1A1A"/>
+                <w:sz w:val="21"/>
+                <w:szCs w:val="21"/>
+              </w:rPr>
+              <w:t>.</w:t>
+            </w:r>
+            <w:r>
+              <w:rPr>
+                <w:rFonts w:ascii="Times New Roman" w:eastAsia="Times New Roman" w:hAnsi="Times New Roman" w:cs="Times New Roman"/>
+                <w:color w:val="1A1A1A"/>
+                <w:sz w:val="21"/>
+                <w:szCs w:val="21"/>
+              </w:rPr>
+              <w:t>0</w:t>
+            </w:r>
+            <w:r>
+              <w:rPr>
+                <w:rFonts w:ascii="Times New Roman" w:eastAsia="Times New Roman" w:hAnsi="Times New Roman" w:cs="Times New Roman"/>
+                <w:color w:val="1A1A1A"/>
+                <w:sz w:val="21"/>
+                <w:szCs w:val="21"/>
+              </w:rPr>
+              <w:t>00.000</w:t>
             </w:r>
           </w:p>
         </w:tc>
@@ -4401,7 +4417,16 @@
                 <w:sz w:val="21"/>
                 <w:szCs w:val="21"/>
               </w:rPr>
-              <w:t>1.500.000</w:t>
+              <w:t>7</w:t>
+            </w:r>
+            <w:r>
+              <w:rPr>
+                <w:rFonts w:ascii="Times New Roman" w:eastAsia="Times New Roman" w:hAnsi="Times New Roman" w:cs="Times New Roman"/>
+                <w:color w:val="1A1A1A"/>
+                <w:sz w:val="21"/>
+                <w:szCs w:val="21"/>
+              </w:rPr>
+              <w:t>.500.000</w:t>
             </w:r>
           </w:p>
         </w:tc>
@@ -4440,7 +4465,16 @@
                 <w:sz w:val="21"/>
                 <w:szCs w:val="21"/>
               </w:rPr>
-              <w:t>2.000.000</w:t>
+              <w:t>10</w:t>
+            </w:r>
+            <w:r>
+              <w:rPr>
+                <w:rFonts w:ascii="Times New Roman" w:eastAsia="Times New Roman" w:hAnsi="Times New Roman" w:cs="Times New Roman"/>
+                <w:color w:val="1A1A1A"/>
+                <w:sz w:val="21"/>
+                <w:szCs w:val="21"/>
+              </w:rPr>
+              <w:t>.000.000</w:t>
             </w:r>
           </w:p>
         </w:tc>
@@ -4561,7 +4595,16 @@
                 <w:sz w:val="21"/>
                 <w:szCs w:val="21"/>
               </w:rPr>
-              <w:t>3.000.000</w:t>
+              <w:t>6</w:t>
+            </w:r>
+            <w:r>
+              <w:rPr>
+                <w:rFonts w:ascii="Times New Roman" w:eastAsia="Times New Roman" w:hAnsi="Times New Roman" w:cs="Times New Roman"/>
+                <w:color w:val="1A1A1A"/>
+                <w:sz w:val="21"/>
+                <w:szCs w:val="21"/>
+              </w:rPr>
+              <w:t>.000.000</w:t>
             </w:r>
           </w:p>
         </w:tc>
@@ -4601,7 +4644,16 @@
                 <w:sz w:val="21"/>
                 <w:szCs w:val="21"/>
               </w:rPr>
-              <w:t>3.000.000</w:t>
+              <w:t>10</w:t>
+            </w:r>
+            <w:r>
+              <w:rPr>
+                <w:rFonts w:ascii="Times New Roman" w:eastAsia="Times New Roman" w:hAnsi="Times New Roman" w:cs="Times New Roman"/>
+                <w:color w:val="1A1A1A"/>
+                <w:sz w:val="21"/>
+                <w:szCs w:val="21"/>
+              </w:rPr>
+              <w:t>.000.000</w:t>
             </w:r>
           </w:p>
         </w:tc>
@@ -4641,7 +4693,16 @@
                 <w:sz w:val="21"/>
                 <w:szCs w:val="21"/>
               </w:rPr>
-              <w:t>3.500.000</w:t>
+              <w:t>12</w:t>
+            </w:r>
+            <w:r>
+              <w:rPr>
+                <w:rFonts w:ascii="Times New Roman" w:eastAsia="Times New Roman" w:hAnsi="Times New Roman" w:cs="Times New Roman"/>
+                <w:color w:val="1A1A1A"/>
+                <w:sz w:val="21"/>
+                <w:szCs w:val="21"/>
+              </w:rPr>
+              <w:t>.500.000</w:t>
             </w:r>
           </w:p>
         </w:tc>
@@ -4759,7 +4820,34 @@
                 <w:sz w:val="21"/>
                 <w:szCs w:val="21"/>
               </w:rPr>
-              <w:t>4.500.000</w:t>
+              <w:t>9</w:t>
+            </w:r>
+            <w:r>
+              <w:rPr>
+                <w:rFonts w:ascii="Times New Roman" w:eastAsia="Times New Roman" w:hAnsi="Times New Roman" w:cs="Times New Roman"/>
+                <w:color w:val="1A1A1A"/>
+                <w:sz w:val="21"/>
+                <w:szCs w:val="21"/>
+              </w:rPr>
+              <w:t>.</w:t>
+            </w:r>
+            <w:r>
+              <w:rPr>
+                <w:rFonts w:ascii="Times New Roman" w:eastAsia="Times New Roman" w:hAnsi="Times New Roman" w:cs="Times New Roman"/>
+                <w:color w:val="1A1A1A"/>
+                <w:sz w:val="21"/>
+                <w:szCs w:val="21"/>
+              </w:rPr>
+              <w:t>0</w:t>
+            </w:r>
+            <w:r>
+              <w:rPr>
+                <w:rFonts w:ascii="Times New Roman" w:eastAsia="Times New Roman" w:hAnsi="Times New Roman" w:cs="Times New Roman"/>
+                <w:color w:val="1A1A1A"/>
+                <w:sz w:val="21"/>
+                <w:szCs w:val="21"/>
+              </w:rPr>
+              <w:t>00.000</w:t>
             </w:r>
           </w:p>
         </w:tc>
@@ -4798,7 +4886,16 @@
                 <w:sz w:val="21"/>
                 <w:szCs w:val="21"/>
               </w:rPr>
-              <w:t>4.500.000</w:t>
+              <w:t>12</w:t>
+            </w:r>
+            <w:r>
+              <w:rPr>
+                <w:rFonts w:ascii="Times New Roman" w:eastAsia="Times New Roman" w:hAnsi="Times New Roman" w:cs="Times New Roman"/>
+                <w:color w:val="1A1A1A"/>
+                <w:sz w:val="21"/>
+                <w:szCs w:val="21"/>
+              </w:rPr>
+              <w:t>.500.000</w:t>
             </w:r>
           </w:p>
         </w:tc>
@@ -4837,7 +4934,16 @@
                 <w:sz w:val="21"/>
                 <w:szCs w:val="21"/>
               </w:rPr>
-              <w:t>5.000.000</w:t>
+              <w:t>14</w:t>
+            </w:r>
+            <w:r>
+              <w:rPr>
+                <w:rFonts w:ascii="Times New Roman" w:eastAsia="Times New Roman" w:hAnsi="Times New Roman" w:cs="Times New Roman"/>
+                <w:color w:val="1A1A1A"/>
+                <w:sz w:val="21"/>
+                <w:szCs w:val="21"/>
+              </w:rPr>
+              <w:t>.000.000</w:t>
             </w:r>
           </w:p>
         </w:tc>
@@ -4918,404 +5024,43 @@
                 <w:sz w:val="21"/>
                 <w:szCs w:val="21"/>
               </w:rPr>
-              <w:t>Từ 30 đến dưới 40 LĐ BHXH / 300–400 LĐ thời vụ</w:t>
-            </w:r>
-          </w:p>
-        </w:tc>
-        <w:tc>
-          <w:tcPr>
-            <w:tcW w:w="0" w:type="auto"/>
-            <w:tcBorders>
-              <w:top w:val="single" w:sz="6" w:space="0" w:color="B8923A"/>
-              <w:left w:val="single" w:sz="6" w:space="0" w:color="B8923A"/>
-              <w:bottom w:val="single" w:sz="6" w:space="0" w:color="B8923A"/>
-              <w:right w:val="single" w:sz="6" w:space="0" w:color="B8923A"/>
-            </w:tcBorders>
-            <w:shd w:val="clear" w:color="auto" w:fill="FCF6E6"/>
-            <w:tcMar>
-              <w:top w:w="75" w:type="dxa"/>
-              <w:left w:w="90" w:type="dxa"/>
-              <w:bottom w:w="75" w:type="dxa"/>
-              <w:right w:w="90" w:type="dxa"/>
-            </w:tcMar>
-            <w:hideMark/>
-          </w:tcPr>
-          <w:p>
-            <w:pPr>
-              <w:spacing w:after="0" w:line="240" w:lineRule="auto"/>
-              <w:jc w:val="right"/>
-              <w:rPr>
-                <w:rFonts w:ascii="Times New Roman" w:eastAsia="Times New Roman" w:hAnsi="Times New Roman" w:cs="Times New Roman"/>
-                <w:color w:val="1A1A1A"/>
-                <w:sz w:val="21"/>
-                <w:szCs w:val="21"/>
-              </w:rPr>
-            </w:pPr>
-            <w:r>
-              <w:rPr>
-                <w:rFonts w:ascii="Times New Roman" w:eastAsia="Times New Roman" w:hAnsi="Times New Roman" w:cs="Times New Roman"/>
-                <w:color w:val="1A1A1A"/>
-                <w:sz w:val="21"/>
-                <w:szCs w:val="21"/>
-              </w:rPr>
-              <w:t>6.000.000</w:t>
-            </w:r>
-          </w:p>
-        </w:tc>
-        <w:tc>
-          <w:tcPr>
-            <w:tcW w:w="0" w:type="auto"/>
-            <w:tcBorders>
-              <w:top w:val="single" w:sz="6" w:space="0" w:color="B8923A"/>
-              <w:left w:val="single" w:sz="6" w:space="0" w:color="B8923A"/>
-              <w:bottom w:val="single" w:sz="6" w:space="0" w:color="B8923A"/>
-              <w:right w:val="single" w:sz="6" w:space="0" w:color="B8923A"/>
-            </w:tcBorders>
-            <w:shd w:val="clear" w:color="auto" w:fill="FCF6E6"/>
-            <w:tcMar>
-              <w:top w:w="75" w:type="dxa"/>
-              <w:left w:w="90" w:type="dxa"/>
-              <w:bottom w:w="75" w:type="dxa"/>
-              <w:right w:w="90" w:type="dxa"/>
-            </w:tcMar>
-            <w:hideMark/>
-          </w:tcPr>
-          <w:p>
-            <w:pPr>
-              <w:spacing w:after="0" w:line="240" w:lineRule="auto"/>
-              <w:jc w:val="right"/>
-              <w:rPr>
-                <w:rFonts w:ascii="Times New Roman" w:eastAsia="Times New Roman" w:hAnsi="Times New Roman" w:cs="Times New Roman"/>
-                <w:color w:val="1A1A1A"/>
-                <w:sz w:val="21"/>
-                <w:szCs w:val="21"/>
-              </w:rPr>
-            </w:pPr>
-            <w:r>
-              <w:rPr>
-                <w:rFonts w:ascii="Times New Roman" w:eastAsia="Times New Roman" w:hAnsi="Times New Roman" w:cs="Times New Roman"/>
-                <w:color w:val="1A1A1A"/>
-                <w:sz w:val="21"/>
-                <w:szCs w:val="21"/>
-              </w:rPr>
-              <w:t>6.000.000</w:t>
-            </w:r>
-          </w:p>
-        </w:tc>
-        <w:tc>
-          <w:tcPr>
-            <w:tcW w:w="0" w:type="auto"/>
-            <w:tcBorders>
-              <w:top w:val="single" w:sz="6" w:space="0" w:color="B8923A"/>
-              <w:left w:val="single" w:sz="6" w:space="0" w:color="B8923A"/>
-              <w:bottom w:val="single" w:sz="6" w:space="0" w:color="B8923A"/>
-              <w:right w:val="single" w:sz="6" w:space="0" w:color="B8923A"/>
-            </w:tcBorders>
-            <w:shd w:val="clear" w:color="auto" w:fill="FCF6E6"/>
-            <w:tcMar>
-              <w:top w:w="75" w:type="dxa"/>
-              <w:left w:w="90" w:type="dxa"/>
-              <w:bottom w:w="75" w:type="dxa"/>
-              <w:right w:w="90" w:type="dxa"/>
-            </w:tcMar>
-            <w:hideMark/>
-          </w:tcPr>
-          <w:p>
-            <w:pPr>
-              <w:spacing w:after="0" w:line="240" w:lineRule="auto"/>
-              <w:jc w:val="right"/>
-              <w:rPr>
-                <w:rFonts w:ascii="Times New Roman" w:eastAsia="Times New Roman" w:hAnsi="Times New Roman" w:cs="Times New Roman"/>
-                <w:color w:val="1A1A1A"/>
-                <w:sz w:val="21"/>
-                <w:szCs w:val="21"/>
-              </w:rPr>
-            </w:pPr>
-            <w:r>
-              <w:rPr>
-                <w:rFonts w:ascii="Times New Roman" w:eastAsia="Times New Roman" w:hAnsi="Times New Roman" w:cs="Times New Roman"/>
-                <w:color w:val="1A1A1A"/>
-                <w:sz w:val="21"/>
-                <w:szCs w:val="21"/>
-              </w:rPr>
-              <w:t>8.000.000</w:t>
-            </w:r>
-          </w:p>
-        </w:tc>
-      </w:tr>
-      <w:tr>
-        <w:tc>
-          <w:tcPr>
-            <w:tcW w:w="0" w:type="auto"/>
-            <w:tcBorders>
-              <w:top w:val="single" w:sz="6" w:space="0" w:color="B8923A"/>
-              <w:left w:val="single" w:sz="6" w:space="0" w:color="B8923A"/>
-              <w:bottom w:val="single" w:sz="6" w:space="0" w:color="B8923A"/>
-              <w:right w:val="single" w:sz="6" w:space="0" w:color="B8923A"/>
-            </w:tcBorders>
-            <w:tcMar>
-              <w:top w:w="75" w:type="dxa"/>
-              <w:left w:w="90" w:type="dxa"/>
-              <w:bottom w:w="75" w:type="dxa"/>
-              <w:right w:w="90" w:type="dxa"/>
-            </w:tcMar>
-            <w:hideMark/>
-          </w:tcPr>
-          <w:p>
-            <w:pPr>
-              <w:spacing w:after="0" w:line="240" w:lineRule="auto"/>
-              <w:jc w:val="center"/>
-              <w:rPr>
-                <w:rFonts w:ascii="Times New Roman" w:eastAsia="Times New Roman" w:hAnsi="Times New Roman" w:cs="Times New Roman"/>
-                <w:color w:val="1A1A1A"/>
-                <w:sz w:val="21"/>
-                <w:szCs w:val="21"/>
-              </w:rPr>
-            </w:pPr>
-            <w:r>
-              <w:rPr>
-                <w:rFonts w:ascii="Times New Roman" w:eastAsia="Times New Roman" w:hAnsi="Times New Roman" w:cs="Times New Roman"/>
-                <w:color w:val="1A1A1A"/>
-                <w:sz w:val="21"/>
-                <w:szCs w:val="21"/>
-              </w:rPr>
-              <w:t>5</w:t>
-            </w:r>
-          </w:p>
-        </w:tc>
-        <w:tc>
-          <w:tcPr>
-            <w:tcW w:w="0" w:type="auto"/>
-            <w:tcBorders>
-              <w:top w:val="single" w:sz="6" w:space="0" w:color="B8923A"/>
-              <w:left w:val="single" w:sz="6" w:space="0" w:color="B8923A"/>
-              <w:bottom w:val="single" w:sz="6" w:space="0" w:color="B8923A"/>
-              <w:right w:val="single" w:sz="6" w:space="0" w:color="B8923A"/>
-            </w:tcBorders>
-            <w:tcMar>
-              <w:top w:w="75" w:type="dxa"/>
-              <w:left w:w="90" w:type="dxa"/>
-              <w:bottom w:w="75" w:type="dxa"/>
-              <w:right w:w="90" w:type="dxa"/>
-            </w:tcMar>
-            <w:hideMark/>
-          </w:tcPr>
-          <w:p>
-            <w:pPr>
-              <w:spacing w:after="0" w:line="240" w:lineRule="auto"/>
-              <w:rPr>
-                <w:rFonts w:ascii="Times New Roman" w:eastAsia="Times New Roman" w:hAnsi="Times New Roman" w:cs="Times New Roman"/>
-                <w:color w:val="1A1A1A"/>
-                <w:sz w:val="21"/>
-                <w:szCs w:val="21"/>
-              </w:rPr>
-            </w:pPr>
-            <w:r>
-              <w:rPr>
-                <w:rFonts w:ascii="Times New Roman" w:eastAsia="Times New Roman" w:hAnsi="Times New Roman" w:cs="Times New Roman"/>
-                <w:color w:val="1A1A1A"/>
-                <w:sz w:val="21"/>
-                <w:szCs w:val="21"/>
-              </w:rPr>
-              <w:t>Từ 40 đến dưới 50 LĐ BHXH / 400–500 LĐ thời vụ</w:t>
-            </w:r>
-          </w:p>
-        </w:tc>
-        <w:tc>
-          <w:tcPr>
-            <w:tcW w:w="0" w:type="auto"/>
-            <w:tcBorders>
-              <w:top w:val="single" w:sz="6" w:space="0" w:color="B8923A"/>
-              <w:left w:val="single" w:sz="6" w:space="0" w:color="B8923A"/>
-              <w:bottom w:val="single" w:sz="6" w:space="0" w:color="B8923A"/>
-              <w:right w:val="single" w:sz="6" w:space="0" w:color="B8923A"/>
-            </w:tcBorders>
-            <w:tcMar>
-              <w:top w:w="75" w:type="dxa"/>
-              <w:left w:w="90" w:type="dxa"/>
-              <w:bottom w:w="75" w:type="dxa"/>
-              <w:right w:w="90" w:type="dxa"/>
-            </w:tcMar>
-            <w:hideMark/>
-          </w:tcPr>
-          <w:p>
-            <w:pPr>
-              <w:spacing w:after="0" w:line="240" w:lineRule="auto"/>
-              <w:jc w:val="right"/>
-              <w:rPr>
-                <w:rFonts w:ascii="Times New Roman" w:eastAsia="Times New Roman" w:hAnsi="Times New Roman" w:cs="Times New Roman"/>
-                <w:color w:val="1A1A1A"/>
-                <w:sz w:val="21"/>
-                <w:szCs w:val="21"/>
-              </w:rPr>
-            </w:pPr>
-            <w:r>
-              <w:rPr>
-                <w:rFonts w:ascii="Times New Roman" w:eastAsia="Times New Roman" w:hAnsi="Times New Roman" w:cs="Times New Roman"/>
-                <w:color w:val="1A1A1A"/>
-                <w:sz w:val="21"/>
-                <w:szCs w:val="21"/>
-              </w:rPr>
-              <w:t>8.000.000</w:t>
-            </w:r>
-          </w:p>
-        </w:tc>
-        <w:tc>
-          <w:tcPr>
-            <w:tcW w:w="0" w:type="auto"/>
-            <w:tcBorders>
-              <w:top w:val="single" w:sz="6" w:space="0" w:color="B8923A"/>
-              <w:left w:val="single" w:sz="6" w:space="0" w:color="B8923A"/>
-              <w:bottom w:val="single" w:sz="6" w:space="0" w:color="B8923A"/>
-              <w:right w:val="single" w:sz="6" w:space="0" w:color="B8923A"/>
-            </w:tcBorders>
-            <w:tcMar>
-              <w:top w:w="75" w:type="dxa"/>
-              <w:left w:w="90" w:type="dxa"/>
-              <w:bottom w:w="75" w:type="dxa"/>
-              <w:right w:w="90" w:type="dxa"/>
-            </w:tcMar>
-            <w:hideMark/>
-          </w:tcPr>
-          <w:p>
-            <w:pPr>
-              <w:spacing w:after="0" w:line="240" w:lineRule="auto"/>
-              <w:jc w:val="right"/>
-              <w:rPr>
-                <w:rFonts w:ascii="Times New Roman" w:eastAsia="Times New Roman" w:hAnsi="Times New Roman" w:cs="Times New Roman"/>
-                <w:color w:val="1A1A1A"/>
-                <w:sz w:val="21"/>
-                <w:szCs w:val="21"/>
-              </w:rPr>
-            </w:pPr>
-            <w:r>
-              <w:rPr>
-                <w:rFonts w:ascii="Times New Roman" w:eastAsia="Times New Roman" w:hAnsi="Times New Roman" w:cs="Times New Roman"/>
-                <w:color w:val="1A1A1A"/>
-                <w:sz w:val="21"/>
-                <w:szCs w:val="21"/>
-              </w:rPr>
-              <w:t>8.000.000</w:t>
-            </w:r>
-          </w:p>
-        </w:tc>
-        <w:tc>
-          <w:tcPr>
-            <w:tcW w:w="0" w:type="auto"/>
-            <w:tcBorders>
-              <w:top w:val="single" w:sz="6" w:space="0" w:color="B8923A"/>
-              <w:left w:val="single" w:sz="6" w:space="0" w:color="B8923A"/>
-              <w:bottom w:val="single" w:sz="6" w:space="0" w:color="B8923A"/>
-              <w:right w:val="single" w:sz="6" w:space="0" w:color="B8923A"/>
-            </w:tcBorders>
-            <w:tcMar>
-              <w:top w:w="75" w:type="dxa"/>
-              <w:left w:w="90" w:type="dxa"/>
-              <w:bottom w:w="75" w:type="dxa"/>
-              <w:right w:w="90" w:type="dxa"/>
-            </w:tcMar>
-            <w:hideMark/>
-          </w:tcPr>
-          <w:p>
-            <w:pPr>
-              <w:spacing w:after="0" w:line="240" w:lineRule="auto"/>
-              <w:jc w:val="right"/>
-              <w:rPr>
-                <w:rFonts w:ascii="Times New Roman" w:eastAsia="Times New Roman" w:hAnsi="Times New Roman" w:cs="Times New Roman"/>
-                <w:color w:val="1A1A1A"/>
-                <w:sz w:val="21"/>
-                <w:szCs w:val="21"/>
-              </w:rPr>
-            </w:pPr>
-            <w:r>
-              <w:rPr>
-                <w:rFonts w:ascii="Times New Roman" w:eastAsia="Times New Roman" w:hAnsi="Times New Roman" w:cs="Times New Roman"/>
-                <w:color w:val="1A1A1A"/>
-                <w:sz w:val="21"/>
-                <w:szCs w:val="21"/>
-              </w:rPr>
-              <w:t>10.000.000</w:t>
-            </w:r>
-          </w:p>
-        </w:tc>
-      </w:tr>
-      <w:tr>
-        <w:tc>
-          <w:tcPr>
-            <w:tcW w:w="0" w:type="auto"/>
-            <w:tcBorders>
-              <w:top w:val="single" w:sz="6" w:space="0" w:color="B8923A"/>
-              <w:left w:val="single" w:sz="6" w:space="0" w:color="B8923A"/>
-              <w:bottom w:val="single" w:sz="6" w:space="0" w:color="B8923A"/>
-              <w:right w:val="single" w:sz="6" w:space="0" w:color="B8923A"/>
-            </w:tcBorders>
-            <w:shd w:val="clear" w:color="auto" w:fill="FCF6E6"/>
-            <w:tcMar>
-              <w:top w:w="75" w:type="dxa"/>
-              <w:left w:w="90" w:type="dxa"/>
-              <w:bottom w:w="75" w:type="dxa"/>
-              <w:right w:w="90" w:type="dxa"/>
-            </w:tcMar>
-            <w:hideMark/>
-          </w:tcPr>
-          <w:p>
-            <w:pPr>
-              <w:spacing w:after="0" w:line="240" w:lineRule="auto"/>
-              <w:jc w:val="center"/>
-              <w:rPr>
-                <w:rFonts w:ascii="Times New Roman" w:eastAsia="Times New Roman" w:hAnsi="Times New Roman" w:cs="Times New Roman"/>
-                <w:color w:val="1A1A1A"/>
-                <w:sz w:val="21"/>
-                <w:szCs w:val="21"/>
-              </w:rPr>
-            </w:pPr>
-            <w:r>
-              <w:rPr>
-                <w:rFonts w:ascii="Times New Roman" w:eastAsia="Times New Roman" w:hAnsi="Times New Roman" w:cs="Times New Roman"/>
-                <w:color w:val="1A1A1A"/>
-                <w:sz w:val="21"/>
-                <w:szCs w:val="21"/>
-              </w:rPr>
-              <w:t>6</w:t>
-            </w:r>
-          </w:p>
-        </w:tc>
-        <w:tc>
-          <w:tcPr>
-            <w:tcW w:w="0" w:type="auto"/>
-            <w:tcBorders>
-              <w:top w:val="single" w:sz="6" w:space="0" w:color="B8923A"/>
-              <w:left w:val="single" w:sz="6" w:space="0" w:color="B8923A"/>
-              <w:bottom w:val="single" w:sz="6" w:space="0" w:color="B8923A"/>
-              <w:right w:val="single" w:sz="6" w:space="0" w:color="B8923A"/>
-            </w:tcBorders>
-            <w:shd w:val="clear" w:color="auto" w:fill="FCF6E6"/>
-            <w:tcMar>
-              <w:top w:w="75" w:type="dxa"/>
-              <w:left w:w="90" w:type="dxa"/>
-              <w:bottom w:w="75" w:type="dxa"/>
-              <w:right w:w="90" w:type="dxa"/>
-            </w:tcMar>
-            <w:hideMark/>
-          </w:tcPr>
-          <w:p>
-            <w:pPr>
-              <w:spacing w:after="0" w:line="240" w:lineRule="auto"/>
-              <w:rPr>
-                <w:rFonts w:ascii="Times New Roman" w:eastAsia="Times New Roman" w:hAnsi="Times New Roman" w:cs="Times New Roman"/>
-                <w:color w:val="1A1A1A"/>
-                <w:sz w:val="21"/>
-                <w:szCs w:val="21"/>
-              </w:rPr>
-            </w:pPr>
-            <w:r>
-              <w:rPr>
-                <w:rFonts w:ascii="Times New Roman" w:eastAsia="Times New Roman" w:hAnsi="Times New Roman" w:cs="Times New Roman"/>
-                <w:color w:val="1A1A1A"/>
-                <w:sz w:val="21"/>
-                <w:szCs w:val="21"/>
-              </w:rPr>
-              <w:t>Trên 51 LĐ BHXH / Trên 500 LĐ thời vụ</w:t>
+              <w:t xml:space="preserve">Trên </w:t>
+            </w:r>
+            <w:r>
+              <w:rPr>
+                <w:rFonts w:ascii="Times New Roman" w:eastAsia="Times New Roman" w:hAnsi="Times New Roman" w:cs="Times New Roman"/>
+                <w:color w:val="1A1A1A"/>
+                <w:sz w:val="21"/>
+                <w:szCs w:val="21"/>
+              </w:rPr>
+              <w:t>30</w:t>
+            </w:r>
+            <w:r>
+              <w:rPr>
+                <w:rFonts w:ascii="Times New Roman" w:eastAsia="Times New Roman" w:hAnsi="Times New Roman" w:cs="Times New Roman"/>
+                <w:color w:val="1A1A1A"/>
+                <w:sz w:val="21"/>
+                <w:szCs w:val="21"/>
+              </w:rPr>
+              <w:t xml:space="preserve"> LĐ BHXH / Trên </w:t>
+            </w:r>
+            <w:r>
+              <w:rPr>
+                <w:rFonts w:ascii="Times New Roman" w:eastAsia="Times New Roman" w:hAnsi="Times New Roman" w:cs="Times New Roman"/>
+                <w:color w:val="1A1A1A"/>
+                <w:sz w:val="21"/>
+                <w:szCs w:val="21"/>
+              </w:rPr>
+              <w:t>3</w:t>
+            </w:r>
+            <w:r>
+              <w:rPr>
+                <w:rFonts w:ascii="Times New Roman" w:eastAsia="Times New Roman" w:hAnsi="Times New Roman" w:cs="Times New Roman"/>
+                <w:color w:val="1A1A1A"/>
+                <w:sz w:val="21"/>
+                <w:szCs w:val="21"/>
+              </w:rPr>
+              <w:t>00 LĐ thời vụ</w:t>
             </w:r>
           </w:p>
         </w:tc>
@@ -5440,7 +5185,25 @@
           <w:sz w:val="26"/>
           <w:szCs w:val="26"/>
         </w:rPr>
-        <w:t>Đăng ký lao động, hồ sơ BHXH, BHYT, BHTN, Công đoàn lần đầu với số lượng dưới 10 người: 3.000.000đ (chưa bao gồm VAT) và 1.000.000đ/lần phát sinh tăng/giảm hàng tháng.</w:t>
+        <w:t xml:space="preserve">Đăng ký lao động, hồ sơ BHXH, BHYT, BHTN, Công đoàn lần đầu với số lượng dưới </w:t>
+      </w:r>
+      <w:r>
+        <w:rPr>
+          <w:rFonts w:ascii="Times New Roman" w:eastAsia="Times New Roman" w:hAnsi="Times New Roman" w:cs="Times New Roman"/>
+          <w:color w:val="1A1A1A"/>
+          <w:sz w:val="26"/>
+          <w:szCs w:val="26"/>
+        </w:rPr>
+        <w:t>5</w:t>
+      </w:r>
+      <w:r>
+        <w:rPr>
+          <w:rFonts w:ascii="Times New Roman" w:eastAsia="Times New Roman" w:hAnsi="Times New Roman" w:cs="Times New Roman"/>
+          <w:color w:val="1A1A1A"/>
+          <w:sz w:val="26"/>
+          <w:szCs w:val="26"/>
+        </w:rPr>
+        <w:t xml:space="preserve"> người: 3.000.000đ (chưa bao gồm VAT) và 1.000.000đ/lần phát sinh tăng/giảm hàng tháng.</w:t>
       </w:r>
     </w:p>
     <w:p>
@@ -5491,7 +5254,7 @@
           <w:sz w:val="26"/>
           <w:szCs w:val="26"/>
         </w:rPr>
-        <w:t>Các quận Thủ Đức, quận 2, quận 7, quận 9 phụ thu tiền xăng 200.000đ/tháng. Các Huyện Nhà Bè, Bình Chánh, Hóc Môn, Củ Chi phụ thu tiền xăng 500.000đ/tháng.</w:t>
+        <w:t>Phụ thu xăng xe với trường hợp di chuyển xa trên 7km</w:t>
       </w:r>
     </w:p>
     <w:p>
@@ -5517,33 +5280,25 @@
           <w:sz w:val="26"/>
           <w:szCs w:val="26"/>
         </w:rPr>
-        <w:t>Biểu phí còn phụ thuộc vào tình hình đặc thù của từng doanh nghiệp.</w:t>
-      </w:r>
-    </w:p>
-    <w:p>
-      <w:pPr>
-        <w:numPr>
-          <w:ilvl w:val="0"/>
-          <w:numId w:val="9"/>
-        </w:numPr>
-        <w:spacing w:before="45" w:after="45" w:line="240" w:lineRule="auto"/>
-        <w:ind w:left="567"/>
-        <w:jc w:val="both"/>
-        <w:rPr>
-          <w:rFonts w:ascii="Times New Roman" w:eastAsia="Times New Roman" w:hAnsi="Times New Roman" w:cs="Times New Roman"/>
-          <w:color w:val="1A1A1A"/>
-          <w:sz w:val="26"/>
-          <w:szCs w:val="26"/>
-        </w:rPr>
-      </w:pPr>
-      <w:r>
-        <w:rPr>
-          <w:rFonts w:ascii="Times New Roman" w:eastAsia="Times New Roman" w:hAnsi="Times New Roman" w:cs="Times New Roman"/>
-          <w:color w:val="1A1A1A"/>
-          <w:sz w:val="26"/>
-          <w:szCs w:val="26"/>
-        </w:rPr>
-        <w:t>Giá trên chưa bao gồm thuế giá trị gia tăng và các loại thuế DN phải nộp cho cơ quan thuế.</w:t>
+        <w:t xml:space="preserve">Giá trên chưa bao gồm thuế </w:t>
+      </w:r>
+      <w:r>
+        <w:rPr>
+          <w:rFonts w:ascii="Times New Roman" w:eastAsia="Times New Roman" w:hAnsi="Times New Roman" w:cs="Times New Roman"/>
+          <w:color w:val="1A1A1A"/>
+          <w:sz w:val="26"/>
+          <w:szCs w:val="26"/>
+        </w:rPr>
+        <w:t>VAT</w:t>
+      </w:r>
+      <w:r>
+        <w:rPr>
+          <w:rFonts w:ascii="Times New Roman" w:eastAsia="Times New Roman" w:hAnsi="Times New Roman" w:cs="Times New Roman"/>
+          <w:color w:val="1A1A1A"/>
+          <w:sz w:val="26"/>
+          <w:szCs w:val="26"/>
+        </w:rPr>
+        <w:t xml:space="preserve"> và các loại thuế DN phải nộp cho cơ quan thuế.</w:t>
       </w:r>
     </w:p>
     <w:tbl>
@@ -5599,7 +5354,6 @@
                 <w:sz w:val="24"/>
                 <w:szCs w:val="24"/>
               </w:rPr>
-              <w:lastRenderedPageBreak/>
               <w:t>ĐẠI DIỆN BÊN A</w:t>
             </w:r>
           </w:p>
@@ -5733,6 +5487,8 @@
               </w:rPr>
               <w:t>(Ký, ghi rõ họ tên)</w:t>
             </w:r>
+            <w:bookmarkStart w:id="0" w:name="_GoBack"/>
+            <w:bookmarkEnd w:id="0"/>
           </w:p>
         </w:tc>
       </w:tr>
@@ -6048,7 +5804,7 @@
       <w:rPr>
         <w:noProof/>
       </w:rPr>
-      <w:pict w14:anchorId="6AA90F29">
+      <w:pict w14:anchorId="611E8400">
         <v:shapetype id="_x0000_t75" coordsize="21600,21600" o:spt="75" o:preferrelative="t" path="m@4@5l@4@11@9@11@9@5xe" filled="f" stroked="f">
           <v:stroke joinstyle="miter"/>
           <v:formulas>
@@ -6115,7 +5871,7 @@
               <w:noProof/>
             </w:rPr>
             <w:drawing>
-              <wp:anchor distT="0" distB="0" distL="114300" distR="114300" simplePos="0" relativeHeight="251660288" behindDoc="0" locked="0" layoutInCell="1" allowOverlap="1" wp14:anchorId="66CB2F69" wp14:editId="12CB2403">
+              <wp:anchor distT="0" distB="0" distL="114300" distR="114300" simplePos="0" relativeHeight="251660288" behindDoc="0" locked="0" layoutInCell="1" allowOverlap="1" wp14:anchorId="6ABADFE5" wp14:editId="1E2C439D">
                 <wp:simplePos x="0" y="0"/>
                 <wp:positionH relativeFrom="column">
                   <wp:posOffset>-3175</wp:posOffset>
@@ -6223,6 +5979,7 @@
       </w:tc>
     </w:tr>
   </w:tbl>
+  <w:p/>
   <w:sdt>
     <w:sdtPr>
       <w:id w:val="1941112780"/>
@@ -6245,7 +6002,7 @@
           <w:rPr>
             <w:noProof/>
           </w:rPr>
-          <w:pict w14:anchorId="08C2E3B7">
+          <w:pict w14:anchorId="232A9556">
             <v:shapetype id="_x0000_t75" coordsize="21600,21600" o:spt="75" o:preferrelative="t" path="m@4@5l@4@11@9@11@9@5xe" filled="f" stroked="f">
               <v:stroke joinstyle="miter"/>
               <v:formulas>
@@ -6287,7 +6044,7 @@
       <w:rPr>
         <w:noProof/>
       </w:rPr>
-      <w:pict w14:anchorId="7D830093">
+      <w:pict w14:anchorId="33AFB9AB">
         <v:shapetype id="_x0000_t75" coordsize="21600,21600" o:spt="75" o:preferrelative="t" path="m@4@5l@4@11@9@11@9@5xe" filled="f" stroked="f">
           <v:stroke joinstyle="miter"/>
           <v:formulas>

</xml_diff>